<commit_message>
feat(imprensa): atualiza modal de imprensa no Estatuto e redireciona dossie para leitor online com nova capa
</commit_message>
<xml_diff>
--- a/assets/press/2026-10-30-release-estatuto-lgbtqia.docx
+++ b/assets/press/2026-10-30-release-estatuto-lgbtqia.docx
@@ -44,7 +44,7 @@
         <w:spacing w:before="0" w:after="135" w:line="288" w:lineRule="auto"/>
       </w:pPr>
       <w:r>
-        <w:t>A mobilização chega ao Congresso Nacional respaldada por um dossiê técnico-científico e jurídico de 70 páginas — disponível na íntegra no portal oficial da campanha, em estatutolgbtqiamais.com.br —, desenhado para converter garantias civis hoje precárias em lei ordinária definitiva. A iniciativa ganha força tática no Parlamento após a pauta registrar avanços expressivos na Câmara dos Deputados e no Senado Federal. Diante da dispersão de projetos de lei avulsos, o Estatuto propõe consolidar em um único microssistema legal todas as salvaguardas em direito de família, segurança pública, saúde, educação e trabalho.</w:t>
+        <w:t>A mobilização chega ao Congresso Nacional respaldada por um dossiê técnico-científico e jurídico de 70 páginas — disponível na íntegra no portal oficial da campanha, em estatutolgbtqiamais.com.br, e no leitor online oficial em https://estatutolgbtqia.com.br/dossie/ —, desenhado para converter garantias civis hoje precárias em lei ordinária definitiva. A iniciativa ganha força tática no Parlamento após a pauta registrar avanços expressivos na Câmara dos Deputados e no Senado Federal. Diante da dispersão de projetos de lei avulsos, o Estatuto propõe consolidar em um único microssistema legal todas as salvaguardas em direito de família, segurança pública, saúde, educação e trabalho.</w:t>
       </w:r>
     </w:p>
     <w:p>
@@ -371,10 +371,10 @@
         <w:rPr>
           <w:b/>
         </w:rPr>
-        <w:t xml:space="preserve">Dossiê Técnico-Científico e Jurídico (70 págs. / íntegra em PDF): </w:t>
-      </w:r>
-      <w:r>
-        <w:t>Acesse em https://data2comms.com.br/estatutolgbtqia/dossie-oficial.pdf</w:t>
+        <w:t xml:space="preserve">Dossiê Técnico-Científico e Jurídico (70 págs. / Leitor Online): </w:t>
+      </w:r>
+      <w:r>
+        <w:t>Acesse no leitor online oficial em https://estatutolgbtqia.com.br/dossie/</w:t>
       </w:r>
     </w:p>
     <w:p>
@@ -494,7 +494,7 @@
         <w:spacing w:before="0" w:after="135" w:line="288" w:lineRule="auto"/>
       </w:pPr>
       <w:r>
-        <w:t>FRENTE NACIONAL PELO ESTATUTO LGBTQIA+. Dossiê Técnico-Científico e Anteprojeto de Lei do Estatuto Nacional dos Direitos da População LGBTQIA+. 70 p., 2026. Disponível em: https://data2comms.com.br/estatutolgbtqia/dossie-oficial.pdf.</w:t>
+        <w:t>FRENTE NACIONAL PELO ESTATUTO LGBTQIA+. Dossiê Técnico-Científico e Anteprojeto de Lei do Estatuto Nacional dos Direitos da População LGBTQIA+. 70 p., 2026. Disponível no leitor online em: https://estatutolgbtqia.com.br/dossie/.</w:t>
       </w:r>
     </w:p>
     <w:p>
@@ -615,7 +615,7 @@
         <w:spacing w:before="0" w:after="135" w:line="288" w:lineRule="auto"/>
       </w:pPr>
       <w:r>
-        <w:t>Material complementar: Acesse o dossiê oficial de 70 páginas com a íntegra da proposta legislativa, tabelas demográficas e justificativa constitucional, ou solicite porta-vozes e dados adicionais pelo canal de imprensa: rennanmetsi@data2comms.com.br.</w:t>
+        <w:t>Material complementar: Acesse o dossiê oficial de 70 páginas diretamente no leitor online oficial (https://estatutolgbtqia.com.br/dossie/), com a íntegra da proposta legislativa, tabelas demográficas e justificativa constitucional, ou solicite porta-vozes e dados adicionais pelo canal de imprensa: rennanmetsi@data2comms.com.br.</w:t>
       </w:r>
     </w:p>
     <w:sectPr>

</xml_diff>